<commit_message>
Corrige le guide commercial : angle intro familiale + objection distance
- Suppression de l'angle errone 'local Hauts-de-France' (ANDRAGOPS est en Alsace)
- Mise en avant de la recommandation via le frere (lead chaud)
- Ajout objection distance (intra groupe 2-3 jours, frais transparents)
- Valorisation Qualiopi / SST INRS / methode C.A.D.R

Co-Authored-By: Claude Opus 4.8 (1M context) <noreply@anthropic.com>
Claude-Session: https://claude.ai/code/session_01DWZPNPELyEGAgNuApAT9EL
</commit_message>
<xml_diff>
--- a/Guide_RDV_Commercial_COUSIN_GROUP.docx
+++ b/Guide_RDV_Commercial_COUSIN_GROUP.docx
@@ -76,7 +76,7 @@
           <w:color w:val="444444"/>
           <w:sz w:val="22"/>
         </w:rPr>
-        <w:t>Angle : sur-mesure &amp; ancrage local (Hauts-de-France)</w:t>
+        <w:t>Atout d'entrée : recommandation de confiance (via votre frère) + expertise INRS/Qualiopi</w:t>
       </w:r>
     </w:p>
     <w:p>
@@ -88,7 +88,7 @@
           <w:color w:val="444444"/>
           <w:sz w:val="22"/>
         </w:rPr>
-        <w:t>Contact : +33 (0)6 35 25 89 22 — Wervicq-Sud (59)</w:t>
+        <w:t>RH à contacter : +33 (0)6 35 25 89 22 — COUSIN GROUP, Wervicq-Sud (59)</w:t>
       </w:r>
     </w:p>
     <w:p>
@@ -236,7 +236,35 @@
               <w:rPr>
                 <w:sz w:val="19"/>
               </w:rPr>
-              <w:t>Formations sécurité obligatoires/recommandées + cohésion, en sur-mesure et local</w:t>
+              <w:t>Formations sécurité obligatoires/recommandées + cohésion, en sur-mesure</w:t>
+            </w:r>
+          </w:p>
+        </w:tc>
+      </w:tr>
+      <w:tr>
+        <w:tc>
+          <w:tcPr>
+            <w:tcW w:type="dxa" w:w="2880"/>
+          </w:tcPr>
+          <w:p>
+            <w:r>
+              <w:rPr>
+                <w:sz w:val="19"/>
+              </w:rPr>
+              <w:t>Atout d'entrée</w:t>
+            </w:r>
+          </w:p>
+        </w:tc>
+        <w:tc>
+          <w:tcPr>
+            <w:tcW w:type="dxa" w:w="6192"/>
+          </w:tcPr>
+          <w:p>
+            <w:r>
+              <w:rPr>
+                <w:sz w:val="19"/>
+              </w:rPr>
+              <w:t>Recommandation via votre frère (lead chaud) + Qualiopi &amp; formateurs SST INRS</w:t>
             </w:r>
           </w:p>
         </w:tc>
@@ -764,7 +792,7 @@
         <w:rPr>
           <w:i/>
         </w:rPr>
-        <w:t>« Bonjour, [Prénom Nom], d'ANDRAGOPS Académie. Merci de me consacrer quelques minutes. On accompagne les entreprises industrielles sur la sécurité et la prévention des risques au travail. »</w:t>
+        <w:t>« Bonjour, [Prénom Nom], d'ANDRAGOPS Académie. C'est [prénom de votre frère] qui m'a parlé de vous — merci de prendre le temps. On accompagne les entreprises industrielles sur la sécurité et la prévention des risques au travail. »</w:t>
       </w:r>
     </w:p>
     <w:p>
@@ -779,7 +807,7 @@
         <w:rPr>
           <w:i/>
         </w:rPr>
-        <w:t>« Concrètement, on forme vos équipes au secourisme (SST), aux gestes et postures, à la PRAP, à l'incendie — et on propose aussi des activités de cohésion. Le tout en sur-mesure et en proximité, ici dans les Hauts-de-France. »</w:t>
+        <w:t>« Concrètement, on forme vos équipes au secourisme (SST), aux gestes et postures, à la PRAP, à l'incendie — et on propose aussi des activités de cohésion. Organisme certifié Qualiopi, formateurs SST INRS, avec 80 % de pratique : on forme pour agir, pas pour tamponner. »</w:t>
       </w:r>
     </w:p>
     <w:p>
@@ -794,7 +822,7 @@
         <w:rPr>
           <w:i/>
         </w:rPr>
-        <w:t>« Avec un site comme le vôtre, il y a forcément des obligations à tenir (secouristes, évacuation, prévention des TMS) — et c'est exactement notre métier. »</w:t>
+        <w:t>« Avec un site industriel comme le vôtre, il y a forcément des obligations à tenir (secouristes, évacuation, prévention des TMS) — et c'est exactement notre métier. »</w:t>
       </w:r>
     </w:p>
     <w:p>
@@ -810,6 +838,14 @@
           <w:i/>
         </w:rPr>
         <w:t>« Avant de vous en dire plus, j'aimerais comprendre où vous en êtes aujourd'hui sur ces sujets. Je peux vous poser quelques questions ? »</w:t>
+      </w:r>
+    </w:p>
+    <w:p>
+      <w:r>
+        <w:rPr>
+          <w:b w:val="0"/>
+        </w:rPr>
+        <w:t>Astuce : la recommandation de votre frère est votre meilleure carte d'entrée — placez-la dès l'accroche, elle ouvre la confiance et fait oublier la distance.</w:t>
       </w:r>
     </w:p>
     <w:p>
@@ -996,6 +1032,21 @@
         <w:rPr>
           <w:b/>
         </w:rPr>
+        <w:t>Recommandation de confiance</w:t>
+      </w:r>
+      <w:r>
+        <w:t xml:space="preserve"> : vous arrivez par votre frère, pas à froid — capitalisez sur ce lien.</w:t>
+      </w:r>
+    </w:p>
+    <w:p>
+      <w:pPr>
+        <w:pStyle w:val="ListBullet"/>
+      </w:pPr>
+      <w:r/>
+      <w:r>
+        <w:rPr>
+          <w:b/>
+        </w:rPr>
         <w:t>Obligation = priorité</w:t>
       </w:r>
       <w:r>
@@ -1026,10 +1077,52 @@
         <w:rPr>
           <w:b/>
         </w:rPr>
-        <w:t>Local &amp; réactif</w:t>
+        <w:t>Expertise reconnue</w:t>
       </w:r>
       <w:r>
-        <w:t xml:space="preserve"> : intervention sur site à Wervicq-Sud, planning calé sur la production, interlocuteur unique.</w:t>
+        <w:t xml:space="preserve"> : organisme </w:t>
+      </w:r>
+      <w:r>
+        <w:rPr>
+          <w:b/>
+        </w:rPr>
+        <w:t>Qualiopi</w:t>
+      </w:r>
+      <w:r>
+        <w:t xml:space="preserve">, formateurs </w:t>
+      </w:r>
+      <w:r>
+        <w:rPr>
+          <w:b/>
+        </w:rPr>
+        <w:t>SST INRS</w:t>
+      </w:r>
+      <w:r>
+        <w:t>, méthode C.A.D.R, 80 % de pratique.</w:t>
+      </w:r>
+    </w:p>
+    <w:p>
+      <w:pPr>
+        <w:pStyle w:val="ListBullet"/>
+      </w:pPr>
+      <w:r/>
+      <w:r>
+        <w:rPr>
+          <w:b/>
+        </w:rPr>
+        <w:t>Distance maîtrisée</w:t>
+      </w:r>
+      <w:r>
+        <w:t xml:space="preserve"> : on vient sur site en </w:t>
+      </w:r>
+      <w:r>
+        <w:rPr>
+          <w:b/>
+        </w:rPr>
+        <w:t>intra</w:t>
+      </w:r>
+      <w:r>
+        <w:t>, en regroupant plusieurs sessions sur 2-3 jours consécutifs pour optimiser le déplacement — vous formez beaucoup de monde en une seule venue.</w:t>
       </w:r>
     </w:p>
     <w:p>
@@ -1059,7 +1152,7 @@
         <w:t>Récurrence maîtrisée</w:t>
       </w:r>
       <w:r>
-        <w:t xml:space="preserve"> : suivi des recyclages MAC SST → vous ne ratez jamais une échéance.</w:t>
+        <w:t xml:space="preserve"> : packs annuels + suivi des recyclages MAC SST → vous ne ratez jamais une échéance.</w:t>
       </w:r>
     </w:p>
     <w:p>
@@ -1074,7 +1167,7 @@
         <w:t>Financement</w:t>
       </w:r>
       <w:r>
-        <w:t xml:space="preserve"> : [si Qualiopi] prise en charge possible via l'OPCO et le plan de développement des compétences.</w:t>
+        <w:t xml:space="preserve"> : organisme Qualiopi → prise en charge possible via l'OPCO et le plan de développement des compétences.</w:t>
       </w:r>
     </w:p>
     <w:p>
@@ -1210,6 +1303,30 @@
       </w:r>
       <w:r>
         <w:t>« Je vous l'envoie. Mais le plus utile serait 30 min pour faire le point sur vos obligations réelles, et je reviens avec une proposition ciblée. On se cale un créneau ? »</w:t>
+      </w:r>
+    </w:p>
+    <w:p>
+      <w:r>
+        <w:rPr>
+          <w:b/>
+          <w:color w:val="1F3A5F"/>
+        </w:rPr>
+        <w:t>« Mais vous êtes en Alsace, c'est loin / les frais de route ? »</w:t>
+      </w:r>
+    </w:p>
+    <w:p>
+      <w:pPr>
+        <w:spacing w:after="200"/>
+      </w:pPr>
+      <w:r>
+        <w:rPr>
+          <w:b/>
+          <w:color w:val="1E6B3A"/>
+        </w:rPr>
+        <w:t xml:space="preserve">→ Réponse : </w:t>
+      </w:r>
+      <w:r>
+        <w:t>« C'est juste, on est basé à Strasbourg. On gère ça simplement : on intervient en intra en regroupant plusieurs sessions sur 2-3 jours, donc un seul déplacement pour former beaucoup de monde. Les frais sont transparents et intégrés au devis — et au final le coût par stagiaire reste compétitif. L'important, c'est la qualité de la formation et le fait qu'on se connaisse déjà. »</w:t>
       </w:r>
     </w:p>
     <w:p>
@@ -1379,7 +1496,24 @@
         <w:pStyle w:val="ListBullet"/>
       </w:pPr>
       <w:r>
-        <w:t>Dossier de recherche COUSIN GROUP + ce guide sous les yeux.</w:t>
+        <w:t xml:space="preserve">Citer </w:t>
+      </w:r>
+      <w:r>
+        <w:rPr>
+          <w:b/>
+        </w:rPr>
+        <w:t>votre frère</w:t>
+      </w:r>
+      <w:r>
+        <w:t xml:space="preserve"> dès l'accroche (« c'est [prénom] qui m'a parlé de vous »).</w:t>
+      </w:r>
+    </w:p>
+    <w:p>
+      <w:pPr>
+        <w:pStyle w:val="ListBullet"/>
+      </w:pPr>
+      <w:r>
+        <w:t>Dossier de recherche COUSIN GROUP + ce guide + le catalogue sous les yeux.</w:t>
       </w:r>
     </w:p>
     <w:p>
@@ -1395,7 +1529,24 @@
         <w:pStyle w:val="ListBullet"/>
       </w:pPr>
       <w:r>
-        <w:t>Mes créneaux de RDV disponibles.</w:t>
+        <w:t xml:space="preserve">Ma réponse prête sur la </w:t>
+      </w:r>
+      <w:r>
+        <w:rPr>
+          <w:b/>
+        </w:rPr>
+        <w:t>distance</w:t>
+      </w:r>
+      <w:r>
+        <w:t xml:space="preserve"> (intra groupé 2-3 jours, frais transparents).</w:t>
+      </w:r>
+    </w:p>
+    <w:p>
+      <w:pPr>
+        <w:pStyle w:val="ListBullet"/>
+      </w:pPr>
+      <w:r>
+        <w:t>Mes créneaux de RDV disponibles + contact : 07 59 73 82 72 · info@andragops-academie.com.</w:t>
       </w:r>
     </w:p>
     <w:p>

</xml_diff>